<commit_message>
docs: align submission diagrams reports and demo with verified process architecture
</commit_message>
<xml_diff>
--- a/docs/part-a/submission/PartA_Submission.docx
+++ b/docs/part-a/submission/PartA_Submission.docx
@@ -679,7 +679,7 @@
             </w:rPr>
             <w:fldChar w:fldCharType="separate"/>
           </w:r>
-          <w:hyperlink w:anchor="_Toc243570718" w:history="1">
+          <w:hyperlink w:anchor="_Toc243652240" w:history="1">
             <w:r>
               <w:rPr>
                 <w:rStyle w:val="af3"/>
@@ -711,7 +711,7 @@
                 <w:noProof/>
                 <w:webHidden/>
               </w:rPr>
-              <w:instrText xml:space="preserve"> PAGEREF _Toc243570718 \h </w:instrText>
+              <w:instrText xml:space="preserve"> PAGEREF _Toc243652240 \h </w:instrText>
             </w:r>
             <w:r>
               <w:rPr>
@@ -759,7 +759,7 @@
               <w:lang w:val="en-US" w:eastAsia="zh-CN"/>
             </w:rPr>
           </w:pPr>
-          <w:hyperlink w:anchor="_Toc243570719" w:history="1">
+          <w:hyperlink w:anchor="_Toc243652241" w:history="1">
             <w:r>
               <w:rPr>
                 <w:rStyle w:val="af3"/>
@@ -791,7 +791,7 @@
                 <w:noProof/>
                 <w:webHidden/>
               </w:rPr>
-              <w:instrText xml:space="preserve"> PAGEREF _Toc243570719 \h </w:instrText>
+              <w:instrText xml:space="preserve"> PAGEREF _Toc243652241 \h </w:instrText>
             </w:r>
             <w:r>
               <w:rPr>
@@ -839,7 +839,7 @@
               <w:lang w:val="en-US" w:eastAsia="zh-CN"/>
             </w:rPr>
           </w:pPr>
-          <w:hyperlink w:anchor="_Toc243570720" w:history="1">
+          <w:hyperlink w:anchor="_Toc243652242" w:history="1">
             <w:r>
               <w:rPr>
                 <w:rStyle w:val="af3"/>
@@ -871,7 +871,7 @@
                 <w:noProof/>
                 <w:webHidden/>
               </w:rPr>
-              <w:instrText xml:space="preserve"> PAGEREF _Toc243570720 \h </w:instrText>
+              <w:instrText xml:space="preserve"> PAGEREF _Toc243652242 \h </w:instrText>
             </w:r>
             <w:r>
               <w:rPr>
@@ -919,7 +919,7 @@
               <w:lang w:val="en-US" w:eastAsia="zh-CN"/>
             </w:rPr>
           </w:pPr>
-          <w:hyperlink w:anchor="_Toc243570721" w:history="1">
+          <w:hyperlink w:anchor="_Toc243652243" w:history="1">
             <w:r>
               <w:rPr>
                 <w:rStyle w:val="af3"/>
@@ -951,7 +951,7 @@
                 <w:noProof/>
                 <w:webHidden/>
               </w:rPr>
-              <w:instrText xml:space="preserve"> PAGEREF _Toc243570721 \h </w:instrText>
+              <w:instrText xml:space="preserve"> PAGEREF _Toc243652243 \h </w:instrText>
             </w:r>
             <w:r>
               <w:rPr>
@@ -999,7 +999,7 @@
               <w:lang w:val="en-US" w:eastAsia="zh-CN"/>
             </w:rPr>
           </w:pPr>
-          <w:hyperlink w:anchor="_Toc243570722" w:history="1">
+          <w:hyperlink w:anchor="_Toc243652244" w:history="1">
             <w:r>
               <w:rPr>
                 <w:rStyle w:val="af3"/>
@@ -1031,7 +1031,7 @@
                 <w:noProof/>
                 <w:webHidden/>
               </w:rPr>
-              <w:instrText xml:space="preserve"> PAGEREF _Toc243570722 \h </w:instrText>
+              <w:instrText xml:space="preserve"> PAGEREF _Toc243652244 \h </w:instrText>
             </w:r>
             <w:r>
               <w:rPr>
@@ -1079,7 +1079,7 @@
               <w:lang w:val="en-US" w:eastAsia="zh-CN"/>
             </w:rPr>
           </w:pPr>
-          <w:hyperlink w:anchor="_Toc243570723" w:history="1">
+          <w:hyperlink w:anchor="_Toc243652245" w:history="1">
             <w:r>
               <w:rPr>
                 <w:rStyle w:val="af3"/>
@@ -1111,7 +1111,7 @@
                 <w:noProof/>
                 <w:webHidden/>
               </w:rPr>
-              <w:instrText xml:space="preserve"> PAGEREF _Toc243570723 \h </w:instrText>
+              <w:instrText xml:space="preserve"> PAGEREF _Toc243652245 \h </w:instrText>
             </w:r>
             <w:r>
               <w:rPr>
@@ -1159,7 +1159,7 @@
               <w:lang w:val="en-US" w:eastAsia="zh-CN"/>
             </w:rPr>
           </w:pPr>
-          <w:hyperlink w:anchor="_Toc243570724" w:history="1">
+          <w:hyperlink w:anchor="_Toc243652246" w:history="1">
             <w:r>
               <w:rPr>
                 <w:rStyle w:val="af3"/>
@@ -1191,7 +1191,7 @@
                 <w:noProof/>
                 <w:webHidden/>
               </w:rPr>
-              <w:instrText xml:space="preserve"> PAGEREF _Toc243570724 \h </w:instrText>
+              <w:instrText xml:space="preserve"> PAGEREF _Toc243652246 \h </w:instrText>
             </w:r>
             <w:r>
               <w:rPr>
@@ -1239,7 +1239,7 @@
               <w:lang w:val="en-US" w:eastAsia="zh-CN"/>
             </w:rPr>
           </w:pPr>
-          <w:hyperlink w:anchor="_Toc243570725" w:history="1">
+          <w:hyperlink w:anchor="_Toc243652247" w:history="1">
             <w:r>
               <w:rPr>
                 <w:rStyle w:val="af3"/>
@@ -1271,7 +1271,7 @@
                 <w:noProof/>
                 <w:webHidden/>
               </w:rPr>
-              <w:instrText xml:space="preserve"> PAGEREF _Toc243570725 \h </w:instrText>
+              <w:instrText xml:space="preserve"> PAGEREF _Toc243652247 \h </w:instrText>
             </w:r>
             <w:r>
               <w:rPr>
@@ -1319,7 +1319,7 @@
               <w:lang w:val="en-US" w:eastAsia="zh-CN"/>
             </w:rPr>
           </w:pPr>
-          <w:hyperlink w:anchor="_Toc243570726" w:history="1">
+          <w:hyperlink w:anchor="_Toc243652248" w:history="1">
             <w:r>
               <w:rPr>
                 <w:rStyle w:val="af3"/>
@@ -1351,7 +1351,7 @@
                 <w:noProof/>
                 <w:webHidden/>
               </w:rPr>
-              <w:instrText xml:space="preserve"> PAGEREF _Toc243570726 \h </w:instrText>
+              <w:instrText xml:space="preserve"> PAGEREF _Toc243652248 \h </w:instrText>
             </w:r>
             <w:r>
               <w:rPr>
@@ -1399,7 +1399,7 @@
               <w:lang w:val="en-US" w:eastAsia="zh-CN"/>
             </w:rPr>
           </w:pPr>
-          <w:hyperlink w:anchor="_Toc243570727" w:history="1">
+          <w:hyperlink w:anchor="_Toc243652249" w:history="1">
             <w:r>
               <w:rPr>
                 <w:rStyle w:val="af3"/>
@@ -1431,7 +1431,7 @@
                 <w:noProof/>
                 <w:webHidden/>
               </w:rPr>
-              <w:instrText xml:space="preserve"> PAGEREF _Toc243570727 \h </w:instrText>
+              <w:instrText xml:space="preserve"> PAGEREF _Toc243652249 \h </w:instrText>
             </w:r>
             <w:r>
               <w:rPr>
@@ -1479,7 +1479,7 @@
               <w:lang w:val="en-US" w:eastAsia="zh-CN"/>
             </w:rPr>
           </w:pPr>
-          <w:hyperlink w:anchor="_Toc243570728" w:history="1">
+          <w:hyperlink w:anchor="_Toc243652250" w:history="1">
             <w:r>
               <w:rPr>
                 <w:rStyle w:val="af3"/>
@@ -1511,7 +1511,7 @@
                 <w:noProof/>
                 <w:webHidden/>
               </w:rPr>
-              <w:instrText xml:space="preserve"> PAGEREF _Toc243570728 \h </w:instrText>
+              <w:instrText xml:space="preserve"> PAGEREF _Toc243652250 \h </w:instrText>
             </w:r>
             <w:r>
               <w:rPr>
@@ -1559,7 +1559,7 @@
               <w:lang w:val="en-US" w:eastAsia="zh-CN"/>
             </w:rPr>
           </w:pPr>
-          <w:hyperlink w:anchor="_Toc243570729" w:history="1">
+          <w:hyperlink w:anchor="_Toc243652251" w:history="1">
             <w:r>
               <w:rPr>
                 <w:rStyle w:val="af3"/>
@@ -1591,7 +1591,7 @@
                 <w:noProof/>
                 <w:webHidden/>
               </w:rPr>
-              <w:instrText xml:space="preserve"> PAGEREF _Toc243570729 \h </w:instrText>
+              <w:instrText xml:space="preserve"> PAGEREF _Toc243652251 \h </w:instrText>
             </w:r>
             <w:r>
               <w:rPr>
@@ -1639,7 +1639,7 @@
               <w:lang w:val="en-US" w:eastAsia="zh-CN"/>
             </w:rPr>
           </w:pPr>
-          <w:hyperlink w:anchor="_Toc243570730" w:history="1">
+          <w:hyperlink w:anchor="_Toc243652252" w:history="1">
             <w:r>
               <w:rPr>
                 <w:rStyle w:val="af3"/>
@@ -1671,7 +1671,7 @@
                 <w:noProof/>
                 <w:webHidden/>
               </w:rPr>
-              <w:instrText xml:space="preserve"> PAGEREF _Toc243570730 \h </w:instrText>
+              <w:instrText xml:space="preserve"> PAGEREF _Toc243652252 \h </w:instrText>
             </w:r>
             <w:r>
               <w:rPr>
@@ -1719,7 +1719,7 @@
               <w:lang w:val="en-US" w:eastAsia="zh-CN"/>
             </w:rPr>
           </w:pPr>
-          <w:hyperlink w:anchor="_Toc243570731" w:history="1">
+          <w:hyperlink w:anchor="_Toc243652253" w:history="1">
             <w:r>
               <w:rPr>
                 <w:rStyle w:val="af3"/>
@@ -1751,7 +1751,7 @@
                 <w:noProof/>
                 <w:webHidden/>
               </w:rPr>
-              <w:instrText xml:space="preserve"> PAGEREF _Toc243570731 \h </w:instrText>
+              <w:instrText xml:space="preserve"> PAGEREF _Toc243652253 \h </w:instrText>
             </w:r>
             <w:r>
               <w:rPr>
@@ -1799,7 +1799,7 @@
               <w:lang w:val="en-US" w:eastAsia="zh-CN"/>
             </w:rPr>
           </w:pPr>
-          <w:hyperlink w:anchor="_Toc243570732" w:history="1">
+          <w:hyperlink w:anchor="_Toc243652254" w:history="1">
             <w:r>
               <w:rPr>
                 <w:rStyle w:val="af3"/>
@@ -1831,7 +1831,7 @@
                 <w:noProof/>
                 <w:webHidden/>
               </w:rPr>
-              <w:instrText xml:space="preserve"> PAGEREF _Toc243570732 \h </w:instrText>
+              <w:instrText xml:space="preserve"> PAGEREF _Toc243652254 \h </w:instrText>
             </w:r>
             <w:r>
               <w:rPr>
@@ -1879,7 +1879,7 @@
               <w:lang w:val="en-US" w:eastAsia="zh-CN"/>
             </w:rPr>
           </w:pPr>
-          <w:hyperlink w:anchor="_Toc243570733" w:history="1">
+          <w:hyperlink w:anchor="_Toc243652255" w:history="1">
             <w:r>
               <w:rPr>
                 <w:rStyle w:val="af3"/>
@@ -1911,7 +1911,7 @@
                 <w:noProof/>
                 <w:webHidden/>
               </w:rPr>
-              <w:instrText xml:space="preserve"> PAGEREF _Toc243570733 \h </w:instrText>
+              <w:instrText xml:space="preserve"> PAGEREF _Toc243652255 \h </w:instrText>
             </w:r>
             <w:r>
               <w:rPr>
@@ -1959,7 +1959,7 @@
               <w:lang w:val="en-US" w:eastAsia="zh-CN"/>
             </w:rPr>
           </w:pPr>
-          <w:hyperlink w:anchor="_Toc243570734" w:history="1">
+          <w:hyperlink w:anchor="_Toc243652256" w:history="1">
             <w:r>
               <w:rPr>
                 <w:rStyle w:val="af3"/>
@@ -1991,7 +1991,7 @@
                 <w:noProof/>
                 <w:webHidden/>
               </w:rPr>
-              <w:instrText xml:space="preserve"> PAGEREF _Toc243570734 \h </w:instrText>
+              <w:instrText xml:space="preserve"> PAGEREF _Toc243652256 \h </w:instrText>
             </w:r>
             <w:r>
               <w:rPr>
@@ -2039,7 +2039,7 @@
               <w:lang w:val="en-US" w:eastAsia="zh-CN"/>
             </w:rPr>
           </w:pPr>
-          <w:hyperlink w:anchor="_Toc243570735" w:history="1">
+          <w:hyperlink w:anchor="_Toc243652257" w:history="1">
             <w:r>
               <w:rPr>
                 <w:rStyle w:val="af3"/>
@@ -2071,7 +2071,7 @@
                 <w:noProof/>
                 <w:webHidden/>
               </w:rPr>
-              <w:instrText xml:space="preserve"> PAGEREF _Toc243570735 \h </w:instrText>
+              <w:instrText xml:space="preserve"> PAGEREF _Toc243652257 \h </w:instrText>
             </w:r>
             <w:r>
               <w:rPr>
@@ -2119,7 +2119,7 @@
               <w:lang w:val="en-US" w:eastAsia="zh-CN"/>
             </w:rPr>
           </w:pPr>
-          <w:hyperlink w:anchor="_Toc243570736" w:history="1">
+          <w:hyperlink w:anchor="_Toc243652258" w:history="1">
             <w:r>
               <w:rPr>
                 <w:rStyle w:val="af3"/>
@@ -2151,7 +2151,7 @@
                 <w:noProof/>
                 <w:webHidden/>
               </w:rPr>
-              <w:instrText xml:space="preserve"> PAGEREF _Toc243570736 \h </w:instrText>
+              <w:instrText xml:space="preserve"> PAGEREF _Toc243652258 \h </w:instrText>
             </w:r>
             <w:r>
               <w:rPr>
@@ -2199,7 +2199,7 @@
               <w:lang w:val="en-US" w:eastAsia="zh-CN"/>
             </w:rPr>
           </w:pPr>
-          <w:hyperlink w:anchor="_Toc243570737" w:history="1">
+          <w:hyperlink w:anchor="_Toc243652259" w:history="1">
             <w:r>
               <w:rPr>
                 <w:rStyle w:val="af3"/>
@@ -2231,7 +2231,7 @@
                 <w:noProof/>
                 <w:webHidden/>
               </w:rPr>
-              <w:instrText xml:space="preserve"> PAGEREF _Toc243570737 \h </w:instrText>
+              <w:instrText xml:space="preserve"> PAGEREF _Toc243652259 \h </w:instrText>
             </w:r>
             <w:r>
               <w:rPr>
@@ -2279,7 +2279,7 @@
               <w:lang w:val="en-US" w:eastAsia="zh-CN"/>
             </w:rPr>
           </w:pPr>
-          <w:hyperlink w:anchor="_Toc243570738" w:history="1">
+          <w:hyperlink w:anchor="_Toc243652260" w:history="1">
             <w:r>
               <w:rPr>
                 <w:rStyle w:val="af3"/>
@@ -2311,7 +2311,7 @@
                 <w:noProof/>
                 <w:webHidden/>
               </w:rPr>
-              <w:instrText xml:space="preserve"> PAGEREF _Toc243570738 \h </w:instrText>
+              <w:instrText xml:space="preserve"> PAGEREF _Toc243652260 \h </w:instrText>
             </w:r>
             <w:r>
               <w:rPr>
@@ -2386,7 +2386,7 @@
       <w:pPr>
         <w:pStyle w:val="10"/>
       </w:pPr>
-      <w:bookmarkStart w:id="0" w:name="_Toc243570718"/>
+      <w:bookmarkStart w:id="0" w:name="_Toc243652240"/>
       <w:r>
         <w:t>Part A. Requirements Specification / Design:</w:t>
       </w:r>
@@ -2396,7 +2396,7 @@
       <w:pPr>
         <w:pStyle w:val="10"/>
       </w:pPr>
-      <w:bookmarkStart w:id="1" w:name="_Toc243570719"/>
+      <w:bookmarkStart w:id="1" w:name="_Toc243652241"/>
       <w:r>
         <w:t>1. PDF Extractor Project</w:t>
       </w:r>
@@ -2406,7 +2406,7 @@
       <w:pPr>
         <w:pStyle w:val="2"/>
       </w:pPr>
-      <w:bookmarkStart w:id="2" w:name="_Toc243570720"/>
+      <w:bookmarkStart w:id="2" w:name="_Toc243652242"/>
       <w:r>
         <w:t>1.1. Introduction</w:t>
       </w:r>
@@ -2414,24 +2414,33 @@
     </w:p>
     <w:p>
       <w:r>
-        <w:t>PDF documents combine fixed page layouts with text, embedded images, metadata and security information. A reader may need a passage from a particular page, a reusable table, an original image, or a protected copy of a document. These tasks become difficult when separate applications use different page conventions, obscure extraction limitations, or overwrite the source. The PDF Extractor project brings the operations into one browser-based workbench while preserving the relationship between a result and its source page.</w:t>
+        <w:t>PDF documents combine fixed page layouts with text, embedded images, metadata and security information. A reader may need a passage from a particular page, a reusable table, an original image, or a protected copy of a document. These tasks become difficult when separate applications use different page conventions, obscure extraction limitations, or overwrite the source. The PDF Extractor project brings the operations into one browser-based workbench while preserving the relationship between a result and its</w:t>
+      </w:r>
+      <w:r>
+        <w:t xml:space="preserve"> source page.</w:t>
       </w:r>
     </w:p>
     <w:p>
       <w:r>
-        <w:t>The intended users include document readers, administrative staff and people responsible for protecting or checking documents. A user selects one PDF, inspects its pages, chooses an operation and supplies the required parameters. The application displays structured results and provides downloads where appropriate. Its scope includes page text and text attributes, regular-expression search, bookmarks, metadata, annotations, simple grid tables, embedded images, encryption, digital signatures and watermarks. Attachment extraction is an optional requirement outside the selected scope. Optical character recognition and unrestricted PDF editing are also outside the scope.</w:t>
+        <w:t>The intended users include document readers, administrative staff and people responsible for protecting or checking documents. A user selects one PDF, inspects its pages, chooses an operation and supplies the required parameters. The application displays structured results and provides downloads where appropriate. Its scope includes page text and text attributes, regular-expression search, bookmarks, metadata, annotations, simple grid tables, embedded images, encryption, digital signatures and watermarks. A</w:t>
+      </w:r>
+      <w:r>
+        <w:t>ttachment extraction is an optional requirement outside the selected scope. Optical character recognition and unrestricted PDF editing are also outside the scope.</w:t>
       </w:r>
     </w:p>
     <w:p>
       <w:r>
-        <w:t>The workbench is a web application served from a Windows-hosted Java environment through a same-origin gateway. Each operation processes an uploaded copy and leaves the original unchanged. Passwords and signing material are supplied only for the operation that needs them. File size, page count and output limits provide explicit operating boundaries. This specification records user needs, resolved ambiguities, assumptions, functional data flows and window navigation so that implementation and acceptance testing can use the same definitions.</w:t>
+        <w:t>The workbench is a web application served from a Windows-hosted Java environment through a same-origin gateway. Each operation processes an uploaded copy and leaves the original unchanged. Passwords and signing material are supplied only for the operation that needs them. File size, page count and output limits provide explicit operating boundaries. This specification records user needs, resolved ambiguities, assumptions, functional data flows and window navigation so that implementation and acceptance test</w:t>
+      </w:r>
+      <w:r>
+        <w:t>ing can use the same definitions.</w:t>
       </w:r>
     </w:p>
     <w:p>
       <w:pPr>
         <w:pStyle w:val="2"/>
       </w:pPr>
-      <w:bookmarkStart w:id="3" w:name="_Toc243570721"/>
+      <w:bookmarkStart w:id="3" w:name="_Toc243652243"/>
       <w:r>
         <w:t>1.2 Key Feature List</w:t>
       </w:r>
@@ -2506,7 +2515,7 @@
       <w:pPr>
         <w:pStyle w:val="2"/>
       </w:pPr>
-      <w:bookmarkStart w:id="4" w:name="_Toc243570722"/>
+      <w:bookmarkStart w:id="4" w:name="_Toc243652244"/>
       <w:r>
         <w:t>1.3 Requirements Elicitation Work</w:t>
       </w:r>
@@ -2516,7 +2525,7 @@
       <w:pPr>
         <w:pStyle w:val="3"/>
       </w:pPr>
-      <w:bookmarkStart w:id="5" w:name="_Toc243570723"/>
+      <w:bookmarkStart w:id="5" w:name="_Toc243652245"/>
       <w:r>
         <w:t>1.3.1 Stakeholders</w:t>
       </w:r>
@@ -2951,7 +2960,7 @@
       <w:pPr>
         <w:pStyle w:val="3"/>
       </w:pPr>
-      <w:bookmarkStart w:id="6" w:name="_Toc243570724"/>
+      <w:bookmarkStart w:id="6" w:name="_Toc243652246"/>
       <w:r>
         <w:t>1.3.2 User Needs Identified</w:t>
       </w:r>
@@ -3042,7 +3051,7 @@
       <w:pPr>
         <w:pStyle w:val="3"/>
       </w:pPr>
-      <w:bookmarkStart w:id="7" w:name="_Toc243570725"/>
+      <w:bookmarkStart w:id="7" w:name="_Toc243652247"/>
       <w:r>
         <w:t>1.3.3 Requirements Questions</w:t>
       </w:r>
@@ -4089,7 +4098,7 @@
       <w:pPr>
         <w:pStyle w:val="3"/>
       </w:pPr>
-      <w:bookmarkStart w:id="8" w:name="_Toc243570726"/>
+      <w:bookmarkStart w:id="8" w:name="_Toc243652248"/>
       <w:r>
         <w:t>1.3.4 Software Requirements Elicitation Questions</w:t>
       </w:r>
@@ -5820,7 +5829,7 @@
               <w:rPr>
                 <w:sz w:val="21"/>
               </w:rPr>
-              <w:t>Initial acceptance envelope: one PDF up to 50 MiB/200 pages, two concurrent core operations and output up to 200 MiB. Timing and sustained throughput require a workload-specific baseline.</w:t>
+              <w:t>Initial acceptance envelope: one PDF up to 50 MiB/200 pages, two concurrent core operations and output up to 200 MiB. A reproducible 20-page text fixture has a response-time target of 5 seconds on the test machine. The processing deadline is 90 seconds; sustained throughput depends on the workload.</w:t>
             </w:r>
           </w:p>
         </w:tc>
@@ -6048,7 +6057,7 @@
         <w:pStyle w:val="10"/>
         <w:pageBreakBefore/>
       </w:pPr>
-      <w:bookmarkStart w:id="9" w:name="_Toc243570727"/>
+      <w:bookmarkStart w:id="9" w:name="_Toc243652249"/>
       <w:r>
         <w:lastRenderedPageBreak/>
         <w:t>2. Functional Requirements (as DFDs &amp; WNDs)</w:t>
@@ -6059,7 +6068,7 @@
       <w:pPr>
         <w:pStyle w:val="2"/>
       </w:pPr>
-      <w:bookmarkStart w:id="10" w:name="_Toc243570728"/>
+      <w:bookmarkStart w:id="10" w:name="_Toc243652250"/>
       <w:r>
         <w:t>2.1 Introduction</w:t>
       </w:r>
@@ -6072,12 +6081,18 @@
     </w:p>
     <w:p>
       <w:r>
-        <w:t>The data-flow diagrams use external entities for document users, rounded processes for transformations, and named arrows for data passed between them. The context diagram establishes the application boundary. The grouped diagrams then separate text-related requirements FR1 to FR9, table requirements FR10 and FR11, image requirement FR12, encryption requirements FR13 to FR16, and signature requirements FR17 to FR19. The watermark flow supplements these groups because watermarking is required by the project brief. FR8 remains excluded, while the optional annotation requirement FR9 is included.</w:t>
+        <w:t>The data-flow diagrams use external entities for document users, rounded processes for transformations, and named arrows for data passed between them. The context diagram establishes the application boundary. The grouped diagrams then separate text-related requirements FR1 to FR9, table requirements FR10 and FR11, image requirement FR12, encryption requirements FR13 to FR16, and signature requirements FR17 to FR19. The watermark flow supplements these groups because watermarking is required by the project b</w:t>
+      </w:r>
+      <w:r>
+        <w:t>rief. FR8 remains excluded, while the optional annotation requirement FR9 is included.</w:t>
       </w:r>
     </w:p>
     <w:p>
       <w:r>
-        <w:t>Error handling is shared across the flows rather than being redefined for each tool. Missing input, invalid page ranges, password failures and unsupported content lead to specific feedback without delivering a misleading successful file. Empty extraction results are distinguished from invalid documents, and signature integrity is distinguished from certificate trust. The window navigation diagram connects file selection, preview, tool panels, result inspection and saving. The accompanying Swagger prototype exposes the same operation parameters and response models, allowing the interface design and the acceptance conditions to be checked against a common contract.</w:t>
+        <w:t xml:space="preserve">Error handling is shared across the flows rather than being redefined for each tool. Missing input, invalid page ranges, password failures and unsupported content lead to specific feedback without delivering a misleading successful file. Empty extraction results are distinguished from invalid documents, and signature integrity is distinguished from certificate trust. The window navigation diagram connects file selection, preview, tool panels, result inspection and saving. The accompanying Swagger prototype </w:t>
+      </w:r>
+      <w:r>
+        <w:t>exposes the same operation parameters and response models, allowing the interface design and the acceptance conditions to be checked against a common contract.</w:t>
       </w:r>
     </w:p>
     <w:p>
@@ -6085,7 +6100,7 @@
         <w:pStyle w:val="2"/>
         <w:pageBreakBefore/>
       </w:pPr>
-      <w:bookmarkStart w:id="11" w:name="_Toc243570729"/>
+      <w:bookmarkStart w:id="11" w:name="_Toc243652251"/>
       <w:r>
         <w:lastRenderedPageBreak/>
         <w:t>2.2 Functional Requirements (FRs) - Data-Flow-Diagram Modelling</w:t>
@@ -6094,7 +6109,7 @@
     </w:p>
     <w:p>
       <w:r>
-        <w:t>Notation: E denotes an external user, P a transformation, and each labelled arrow a data flow. The diagrams focus on the PDF operation boundary, not middleware deployment topology.</w:t>
+        <w:t>External boxes represent document users, rounded nodes represent transformations, and named arrows show the data exchanged. Functional names identify the nodes; FR labels retain requirement traceability. The diagrams describe PDF data flows rather than deployment topology.</w:t>
       </w:r>
     </w:p>
     <w:p>
@@ -6107,7 +6122,7 @@
           <w:noProof/>
         </w:rPr>
         <w:drawing>
-          <wp:inline distT="0" distB="0" distL="0" distR="0" wp14:anchorId="2856B396" wp14:editId="21344F1F">
+          <wp:inline distT="0" distB="0" distL="0" distR="0" wp14:anchorId="0629A615" wp14:editId="06D5150D">
             <wp:extent cx="5760000" cy="2550857"/>
             <wp:effectExtent l="0" t="0" r="0" b="0"/>
             <wp:docPr id="1" name="Picture 1"/>
@@ -6425,7 +6440,7 @@
         <w:pStyle w:val="3"/>
         <w:pageBreakBefore/>
       </w:pPr>
-      <w:bookmarkStart w:id="12" w:name="_Toc243570730"/>
+      <w:bookmarkStart w:id="12" w:name="_Toc243652252"/>
       <w:r>
         <w:lastRenderedPageBreak/>
         <w:t>2.2.1 Text Extraction FR1 through to FR9 DFD</w:t>
@@ -6447,7 +6462,7 @@
           <w:noProof/>
         </w:rPr>
         <w:drawing>
-          <wp:inline distT="0" distB="0" distL="0" distR="0" wp14:anchorId="6ECC12A1" wp14:editId="25F39770">
+          <wp:inline distT="0" distB="0" distL="0" distR="0" wp14:anchorId="379547A6" wp14:editId="74EA806C">
             <wp:extent cx="5760000" cy="4608000"/>
             <wp:effectExtent l="0" t="0" r="0" b="0"/>
             <wp:docPr id="2" name="Picture 2"/>
@@ -6516,7 +6531,7 @@
         <w:pStyle w:val="3"/>
         <w:pageBreakBefore/>
       </w:pPr>
-      <w:bookmarkStart w:id="13" w:name="_Toc243570731"/>
+      <w:bookmarkStart w:id="13" w:name="_Toc243652253"/>
       <w:r>
         <w:lastRenderedPageBreak/>
         <w:t>2.2.2 Table Extraction FR10 and FR11 DFD</w:t>
@@ -6538,7 +6553,7 @@
           <w:noProof/>
         </w:rPr>
         <w:drawing>
-          <wp:inline distT="0" distB="0" distL="0" distR="0" wp14:anchorId="0D055B5D" wp14:editId="218EB0B1">
+          <wp:inline distT="0" distB="0" distL="0" distR="0" wp14:anchorId="634D9642" wp14:editId="328A58E4">
             <wp:extent cx="5760000" cy="4608000"/>
             <wp:effectExtent l="0" t="0" r="0" b="0"/>
             <wp:docPr id="3" name="Picture 3"/>
@@ -6607,7 +6622,7 @@
         <w:pStyle w:val="3"/>
         <w:pageBreakBefore/>
       </w:pPr>
-      <w:bookmarkStart w:id="14" w:name="_Toc243570732"/>
+      <w:bookmarkStart w:id="14" w:name="_Toc243652254"/>
       <w:r>
         <w:lastRenderedPageBreak/>
         <w:t>2.2.3 Image Extract FR12 DFD</w:t>
@@ -6629,7 +6644,7 @@
           <w:noProof/>
         </w:rPr>
         <w:drawing>
-          <wp:inline distT="0" distB="0" distL="0" distR="0" wp14:anchorId="7A1D28B9" wp14:editId="4BB04AC6">
+          <wp:inline distT="0" distB="0" distL="0" distR="0" wp14:anchorId="0080E06C" wp14:editId="6B2E4E8C">
             <wp:extent cx="5760000" cy="4608000"/>
             <wp:effectExtent l="0" t="0" r="0" b="0"/>
             <wp:docPr id="4" name="Picture 4"/>
@@ -6698,7 +6713,7 @@
         <w:pStyle w:val="3"/>
         <w:pageBreakBefore/>
       </w:pPr>
-      <w:bookmarkStart w:id="15" w:name="_Toc243570733"/>
+      <w:bookmarkStart w:id="15" w:name="_Toc243652255"/>
       <w:r>
         <w:lastRenderedPageBreak/>
         <w:t>2.2.4 PDF Encryption FR13 through to FR16 DFD</w:t>
@@ -6720,7 +6735,7 @@
           <w:noProof/>
         </w:rPr>
         <w:drawing>
-          <wp:inline distT="0" distB="0" distL="0" distR="0" wp14:anchorId="45317AA7" wp14:editId="163B21A7">
+          <wp:inline distT="0" distB="0" distL="0" distR="0" wp14:anchorId="6A883D5B" wp14:editId="07A6B20A">
             <wp:extent cx="5760000" cy="4608000"/>
             <wp:effectExtent l="0" t="0" r="0" b="0"/>
             <wp:docPr id="5" name="Picture 5"/>
@@ -6789,7 +6804,7 @@
         <w:pStyle w:val="3"/>
         <w:pageBreakBefore/>
       </w:pPr>
-      <w:bookmarkStart w:id="16" w:name="_Toc243570734"/>
+      <w:bookmarkStart w:id="16" w:name="_Toc243652256"/>
       <w:r>
         <w:lastRenderedPageBreak/>
         <w:t>2.2.5 Digital Signature FR17 through to FR19 DFD</w:t>
@@ -6811,7 +6826,7 @@
           <w:noProof/>
         </w:rPr>
         <w:drawing>
-          <wp:inline distT="0" distB="0" distL="0" distR="0" wp14:anchorId="7586B3FE" wp14:editId="4BB41D8B">
+          <wp:inline distT="0" distB="0" distL="0" distR="0" wp14:anchorId="2108E547" wp14:editId="6D509EBF">
             <wp:extent cx="5760000" cy="4608000"/>
             <wp:effectExtent l="0" t="0" r="0" b="0"/>
             <wp:docPr id="6" name="Picture 6"/>
@@ -6880,7 +6895,7 @@
         <w:pStyle w:val="3"/>
         <w:pageBreakBefore/>
       </w:pPr>
-      <w:bookmarkStart w:id="17" w:name="_Toc243570735"/>
+      <w:bookmarkStart w:id="17" w:name="_Toc243652257"/>
       <w:r>
         <w:lastRenderedPageBreak/>
         <w:t>2.2.6 Watermarking DFD</w:t>
@@ -6902,7 +6917,7 @@
           <w:noProof/>
         </w:rPr>
         <w:drawing>
-          <wp:inline distT="0" distB="0" distL="0" distR="0" wp14:anchorId="57DE4A84" wp14:editId="05DD8ECF">
+          <wp:inline distT="0" distB="0" distL="0" distR="0" wp14:anchorId="48E6E9F1" wp14:editId="5DA99366">
             <wp:extent cx="5760000" cy="4608000"/>
             <wp:effectExtent l="0" t="0" r="0" b="0"/>
             <wp:docPr id="7" name="Picture 7"/>
@@ -6971,7 +6986,7 @@
         <w:pStyle w:val="2"/>
         <w:pageBreakBefore/>
       </w:pPr>
-      <w:bookmarkStart w:id="18" w:name="_Toc243570736"/>
+      <w:bookmarkStart w:id="18" w:name="_Toc243652258"/>
       <w:r>
         <w:lastRenderedPageBreak/>
         <w:t>2.3 Functional Requirements - Error Handling Common Use Package</w:t>
@@ -7919,11 +7934,125 @@
           </w:p>
         </w:tc>
       </w:tr>
+      <w:tr>
+        <w:trPr>
+          <w:cantSplit/>
+          <w:jc w:val="center"/>
+        </w:trPr>
+        <w:tc>
+          <w:tcPr>
+            <w:tcW w:w="2098" w:type="dxa"/>
+            <w:vAlign w:val="center"/>
+          </w:tcPr>
+          <w:p>
+            <w:pPr>
+              <w:spacing w:before="20" w:after="20" w:line="252" w:lineRule="auto"/>
+            </w:pPr>
+            <w:r>
+              <w:rPr>
+                <w:sz w:val="20"/>
+              </w:rPr>
+              <w:t>Processing deadline exceeded</w:t>
+            </w:r>
+          </w:p>
+        </w:tc>
+        <w:tc>
+          <w:tcPr>
+            <w:tcW w:w="3061" w:type="dxa"/>
+            <w:vAlign w:val="center"/>
+          </w:tcPr>
+          <w:p>
+            <w:pPr>
+              <w:spacing w:before="20" w:after="20" w:line="252" w:lineRule="auto"/>
+            </w:pPr>
+            <w:r>
+              <w:rPr>
+                <w:sz w:val="19"/>
+              </w:rPr>
+              <w:t>504 PDF_TIMEOUT</w:t>
+            </w:r>
+          </w:p>
+        </w:tc>
+        <w:tc>
+          <w:tcPr>
+            <w:tcW w:w="3855" w:type="dxa"/>
+            <w:vAlign w:val="center"/>
+          </w:tcPr>
+          <w:p>
+            <w:pPr>
+              <w:spacing w:before="20" w:after="20" w:line="252" w:lineRule="auto"/>
+            </w:pPr>
+            <w:r>
+              <w:rPr>
+                <w:sz w:val="20"/>
+              </w:rPr>
+              <w:t>This operation exceeded its time limit; reduce the selected work or try another PDF.</w:t>
+            </w:r>
+          </w:p>
+        </w:tc>
+      </w:tr>
+      <w:tr>
+        <w:trPr>
+          <w:cantSplit/>
+          <w:jc w:val="center"/>
+        </w:trPr>
+        <w:tc>
+          <w:tcPr>
+            <w:tcW w:w="2098" w:type="dxa"/>
+            <w:vAlign w:val="center"/>
+          </w:tcPr>
+          <w:p>
+            <w:pPr>
+              <w:spacing w:before="20" w:after="20" w:line="252" w:lineRule="auto"/>
+            </w:pPr>
+            <w:r>
+              <w:rPr>
+                <w:sz w:val="20"/>
+              </w:rPr>
+              <w:t>Processing subprocess failed</w:t>
+            </w:r>
+          </w:p>
+        </w:tc>
+        <w:tc>
+          <w:tcPr>
+            <w:tcW w:w="3061" w:type="dxa"/>
+            <w:vAlign w:val="center"/>
+          </w:tcPr>
+          <w:p>
+            <w:pPr>
+              <w:spacing w:before="20" w:after="20" w:line="252" w:lineRule="auto"/>
+            </w:pPr>
+            <w:r>
+              <w:rPr>
+                <w:sz w:val="19"/>
+              </w:rPr>
+              <w:t>503 PDF_PROCESS_FAILED</w:t>
+            </w:r>
+          </w:p>
+        </w:tc>
+        <w:tc>
+          <w:tcPr>
+            <w:tcW w:w="3855" w:type="dxa"/>
+            <w:vAlign w:val="center"/>
+          </w:tcPr>
+          <w:p>
+            <w:pPr>
+              <w:spacing w:before="20" w:after="20" w:line="252" w:lineRule="auto"/>
+            </w:pPr>
+            <w:r>
+              <w:rPr>
+                <w:sz w:val="20"/>
+              </w:rPr>
+              <w:t>The processing task did not complete; no result file is delivered.</w:t>
+            </w:r>
+          </w:p>
+        </w:tc>
+      </w:tr>
     </w:tbl>
     <w:p/>
     <w:p>
       <w:r>
-        <w:t>Additional shared limits return 413 for excessive size/pages/output and 429 CAPACITY_EXCEEDED when core processing capacity is occupied. Password and permission errors are separate. Client responses omit credentials, signing keys, stack traces and internal file paths.</w:t>
+        <w:t>Additional shared limits return 413 for excessive size/pages/output and 429 CAPACITY_EXCEEDED when core processing capacity is occupied. An operation exceeding 90 seconds returns 504 PDF_TIMEOUT; a failed processing subprocess returns 503 without a partial result. Password and permission errors are separate. Client responses omit credentials, signing keys, stack traces and internal file paths.</w:t>
       </w:r>
     </w:p>
     <w:p>
@@ -7931,7 +8060,7 @@
         <w:pStyle w:val="2"/>
         <w:pageBreakBefore/>
       </w:pPr>
-      <w:bookmarkStart w:id="19" w:name="_Toc243570737"/>
+      <w:bookmarkStart w:id="19" w:name="_Toc243652259"/>
       <w:r>
         <w:lastRenderedPageBreak/>
         <w:t>2.4 Functional Requirements - Window Navigation Diagram Prototype</w:t>
@@ -7953,7 +8082,7 @@
           <w:noProof/>
         </w:rPr>
         <w:drawing>
-          <wp:inline distT="0" distB="0" distL="0" distR="0" wp14:anchorId="1FBC6169" wp14:editId="18F1B431">
+          <wp:inline distT="0" distB="0" distL="0" distR="0" wp14:anchorId="4D888985" wp14:editId="0A108883">
             <wp:extent cx="5760000" cy="5718857"/>
             <wp:effectExtent l="0" t="0" r="0" b="0"/>
             <wp:docPr id="8" name="Picture 8"/>
@@ -8018,7 +8147,7 @@
         </w:rPr>
         <w:lastRenderedPageBreak/>
         <w:drawing>
-          <wp:inline distT="0" distB="0" distL="0" distR="0" wp14:anchorId="0B9A7460" wp14:editId="3F6F3FAC">
+          <wp:inline distT="0" distB="0" distL="0" distR="0" wp14:anchorId="3751D139" wp14:editId="58D4440F">
             <wp:extent cx="5760000" cy="4114286"/>
             <wp:effectExtent l="0" t="0" r="0" b="0"/>
             <wp:docPr id="9" name="Picture 9"/>
@@ -8071,7 +8200,7 @@
       <w:pPr>
         <w:pStyle w:val="3"/>
       </w:pPr>
-      <w:bookmarkStart w:id="20" w:name="_Toc243570738"/>
+      <w:bookmarkStart w:id="20" w:name="_Toc243652260"/>
       <w:r>
         <w:t>Swagger interface prototype</w:t>
       </w:r>
@@ -8098,10 +8227,10 @@
         <w:tblLook w:val="04A0" w:firstRow="1" w:lastRow="0" w:firstColumn="1" w:lastColumn="0" w:noHBand="0" w:noVBand="1"/>
       </w:tblPr>
       <w:tblGrid>
-        <w:gridCol w:w="794"/>
-        <w:gridCol w:w="4592"/>
-        <w:gridCol w:w="850"/>
-        <w:gridCol w:w="2778"/>
+        <w:gridCol w:w="680"/>
+        <w:gridCol w:w="3628"/>
+        <w:gridCol w:w="2098"/>
+        <w:gridCol w:w="2608"/>
       </w:tblGrid>
       <w:tr>
         <w:trPr>
@@ -8111,7 +8240,7 @@
         </w:trPr>
         <w:tc>
           <w:tcPr>
-            <w:tcW w:w="794" w:type="dxa"/>
+            <w:tcW w:w="680" w:type="dxa"/>
             <w:vAlign w:val="center"/>
           </w:tcPr>
           <w:p>
@@ -8129,7 +8258,7 @@
         </w:tc>
         <w:tc>
           <w:tcPr>
-            <w:tcW w:w="4592" w:type="dxa"/>
+            <w:tcW w:w="3628" w:type="dxa"/>
             <w:vAlign w:val="center"/>
           </w:tcPr>
           <w:p>
@@ -8147,7 +8276,7 @@
         </w:tc>
         <w:tc>
           <w:tcPr>
-            <w:tcW w:w="850" w:type="dxa"/>
+            <w:tcW w:w="2098" w:type="dxa"/>
             <w:vAlign w:val="center"/>
           </w:tcPr>
           <w:p>
@@ -8165,7 +8294,7 @@
         </w:tc>
         <w:tc>
           <w:tcPr>
-            <w:tcW w:w="2778" w:type="dxa"/>
+            <w:tcW w:w="2608" w:type="dxa"/>
             <w:vAlign w:val="center"/>
           </w:tcPr>
           <w:p>
@@ -8189,7 +8318,7 @@
         </w:trPr>
         <w:tc>
           <w:tcPr>
-            <w:tcW w:w="794" w:type="dxa"/>
+            <w:tcW w:w="680" w:type="dxa"/>
             <w:vAlign w:val="center"/>
           </w:tcPr>
           <w:p>
@@ -8206,7 +8335,7 @@
         </w:tc>
         <w:tc>
           <w:tcPr>
-            <w:tcW w:w="4592" w:type="dxa"/>
+            <w:tcW w:w="3628" w:type="dxa"/>
             <w:vAlign w:val="center"/>
           </w:tcPr>
           <w:p>
@@ -8223,24 +8352,24 @@
         </w:tc>
         <w:tc>
           <w:tcPr>
-            <w:tcW w:w="850" w:type="dxa"/>
-            <w:vAlign w:val="center"/>
-          </w:tcPr>
-          <w:p>
-            <w:pPr>
-              <w:spacing w:before="60" w:after="60" w:line="252" w:lineRule="auto"/>
-            </w:pPr>
-            <w:r>
-              <w:rPr>
-                <w:sz w:val="21"/>
-              </w:rPr>
-              <w:t>W02</w:t>
-            </w:r>
-          </w:p>
-        </w:tc>
-        <w:tc>
-          <w:tcPr>
-            <w:tcW w:w="2778" w:type="dxa"/>
+            <w:tcW w:w="2098" w:type="dxa"/>
+            <w:vAlign w:val="center"/>
+          </w:tcPr>
+          <w:p>
+            <w:pPr>
+              <w:spacing w:before="60" w:after="60" w:line="252" w:lineRule="auto"/>
+            </w:pPr>
+            <w:r>
+              <w:rPr>
+                <w:sz w:val="21"/>
+              </w:rPr>
+              <w:t>Text and search</w:t>
+            </w:r>
+          </w:p>
+        </w:tc>
+        <w:tc>
+          <w:tcPr>
+            <w:tcW w:w="2608" w:type="dxa"/>
             <w:vAlign w:val="center"/>
           </w:tcPr>
           <w:p>
@@ -8263,7 +8392,7 @@
         </w:trPr>
         <w:tc>
           <w:tcPr>
-            <w:tcW w:w="794" w:type="dxa"/>
+            <w:tcW w:w="680" w:type="dxa"/>
             <w:vAlign w:val="center"/>
           </w:tcPr>
           <w:p>
@@ -8280,7 +8409,7 @@
         </w:tc>
         <w:tc>
           <w:tcPr>
-            <w:tcW w:w="4592" w:type="dxa"/>
+            <w:tcW w:w="3628" w:type="dxa"/>
             <w:vAlign w:val="center"/>
           </w:tcPr>
           <w:p>
@@ -8297,24 +8426,24 @@
         </w:tc>
         <w:tc>
           <w:tcPr>
-            <w:tcW w:w="850" w:type="dxa"/>
-            <w:vAlign w:val="center"/>
-          </w:tcPr>
-          <w:p>
-            <w:pPr>
-              <w:spacing w:before="60" w:after="60" w:line="252" w:lineRule="auto"/>
-            </w:pPr>
-            <w:r>
-              <w:rPr>
-                <w:sz w:val="21"/>
-              </w:rPr>
-              <w:t>W02</w:t>
-            </w:r>
-          </w:p>
-        </w:tc>
-        <w:tc>
-          <w:tcPr>
-            <w:tcW w:w="2778" w:type="dxa"/>
+            <w:tcW w:w="2098" w:type="dxa"/>
+            <w:vAlign w:val="center"/>
+          </w:tcPr>
+          <w:p>
+            <w:pPr>
+              <w:spacing w:before="60" w:after="60" w:line="252" w:lineRule="auto"/>
+            </w:pPr>
+            <w:r>
+              <w:rPr>
+                <w:sz w:val="21"/>
+              </w:rPr>
+              <w:t>Text and search</w:t>
+            </w:r>
+          </w:p>
+        </w:tc>
+        <w:tc>
+          <w:tcPr>
+            <w:tcW w:w="2608" w:type="dxa"/>
             <w:vAlign w:val="center"/>
           </w:tcPr>
           <w:p>
@@ -8337,7 +8466,7 @@
         </w:trPr>
         <w:tc>
           <w:tcPr>
-            <w:tcW w:w="794" w:type="dxa"/>
+            <w:tcW w:w="680" w:type="dxa"/>
             <w:vAlign w:val="center"/>
           </w:tcPr>
           <w:p>
@@ -8354,7 +8483,7 @@
         </w:tc>
         <w:tc>
           <w:tcPr>
-            <w:tcW w:w="4592" w:type="dxa"/>
+            <w:tcW w:w="3628" w:type="dxa"/>
             <w:vAlign w:val="center"/>
           </w:tcPr>
           <w:p>
@@ -8371,24 +8500,24 @@
         </w:tc>
         <w:tc>
           <w:tcPr>
-            <w:tcW w:w="850" w:type="dxa"/>
-            <w:vAlign w:val="center"/>
-          </w:tcPr>
-          <w:p>
-            <w:pPr>
-              <w:spacing w:before="60" w:after="60" w:line="252" w:lineRule="auto"/>
-            </w:pPr>
-            <w:r>
-              <w:rPr>
-                <w:sz w:val="21"/>
-              </w:rPr>
-              <w:t>W05</w:t>
-            </w:r>
-          </w:p>
-        </w:tc>
-        <w:tc>
-          <w:tcPr>
-            <w:tcW w:w="2778" w:type="dxa"/>
+            <w:tcW w:w="2098" w:type="dxa"/>
+            <w:vAlign w:val="center"/>
+          </w:tcPr>
+          <w:p>
+            <w:pPr>
+              <w:spacing w:before="60" w:after="60" w:line="252" w:lineRule="auto"/>
+            </w:pPr>
+            <w:r>
+              <w:rPr>
+                <w:sz w:val="21"/>
+              </w:rPr>
+              <w:t>Document information</w:t>
+            </w:r>
+          </w:p>
+        </w:tc>
+        <w:tc>
+          <w:tcPr>
+            <w:tcW w:w="2608" w:type="dxa"/>
             <w:vAlign w:val="center"/>
           </w:tcPr>
           <w:p>
@@ -8411,7 +8540,7 @@
         </w:trPr>
         <w:tc>
           <w:tcPr>
-            <w:tcW w:w="794" w:type="dxa"/>
+            <w:tcW w:w="680" w:type="dxa"/>
             <w:vAlign w:val="center"/>
           </w:tcPr>
           <w:p>
@@ -8428,7 +8557,7 @@
         </w:tc>
         <w:tc>
           <w:tcPr>
-            <w:tcW w:w="4592" w:type="dxa"/>
+            <w:tcW w:w="3628" w:type="dxa"/>
             <w:vAlign w:val="center"/>
           </w:tcPr>
           <w:p>
@@ -8445,24 +8574,24 @@
         </w:tc>
         <w:tc>
           <w:tcPr>
-            <w:tcW w:w="850" w:type="dxa"/>
-            <w:vAlign w:val="center"/>
-          </w:tcPr>
-          <w:p>
-            <w:pPr>
-              <w:spacing w:before="60" w:after="60" w:line="252" w:lineRule="auto"/>
-            </w:pPr>
-            <w:r>
-              <w:rPr>
-                <w:sz w:val="21"/>
-              </w:rPr>
-              <w:t>W03</w:t>
-            </w:r>
-          </w:p>
-        </w:tc>
-        <w:tc>
-          <w:tcPr>
-            <w:tcW w:w="2778" w:type="dxa"/>
+            <w:tcW w:w="2098" w:type="dxa"/>
+            <w:vAlign w:val="center"/>
+          </w:tcPr>
+          <w:p>
+            <w:pPr>
+              <w:spacing w:before="60" w:after="60" w:line="252" w:lineRule="auto"/>
+            </w:pPr>
+            <w:r>
+              <w:rPr>
+                <w:sz w:val="21"/>
+              </w:rPr>
+              <w:t>Tables and CSV</w:t>
+            </w:r>
+          </w:p>
+        </w:tc>
+        <w:tc>
+          <w:tcPr>
+            <w:tcW w:w="2608" w:type="dxa"/>
             <w:vAlign w:val="center"/>
           </w:tcPr>
           <w:p>
@@ -8485,7 +8614,7 @@
         </w:trPr>
         <w:tc>
           <w:tcPr>
-            <w:tcW w:w="794" w:type="dxa"/>
+            <w:tcW w:w="680" w:type="dxa"/>
             <w:vAlign w:val="center"/>
           </w:tcPr>
           <w:p>
@@ -8502,7 +8631,7 @@
         </w:tc>
         <w:tc>
           <w:tcPr>
-            <w:tcW w:w="4592" w:type="dxa"/>
+            <w:tcW w:w="3628" w:type="dxa"/>
             <w:vAlign w:val="center"/>
           </w:tcPr>
           <w:p>
@@ -8519,24 +8648,24 @@
         </w:tc>
         <w:tc>
           <w:tcPr>
-            <w:tcW w:w="850" w:type="dxa"/>
-            <w:vAlign w:val="center"/>
-          </w:tcPr>
-          <w:p>
-            <w:pPr>
-              <w:spacing w:before="60" w:after="60" w:line="252" w:lineRule="auto"/>
-            </w:pPr>
-            <w:r>
-              <w:rPr>
-                <w:sz w:val="21"/>
-              </w:rPr>
-              <w:t>W03</w:t>
-            </w:r>
-          </w:p>
-        </w:tc>
-        <w:tc>
-          <w:tcPr>
-            <w:tcW w:w="2778" w:type="dxa"/>
+            <w:tcW w:w="2098" w:type="dxa"/>
+            <w:vAlign w:val="center"/>
+          </w:tcPr>
+          <w:p>
+            <w:pPr>
+              <w:spacing w:before="60" w:after="60" w:line="252" w:lineRule="auto"/>
+            </w:pPr>
+            <w:r>
+              <w:rPr>
+                <w:sz w:val="21"/>
+              </w:rPr>
+              <w:t>Tables and CSV</w:t>
+            </w:r>
+          </w:p>
+        </w:tc>
+        <w:tc>
+          <w:tcPr>
+            <w:tcW w:w="2608" w:type="dxa"/>
             <w:vAlign w:val="center"/>
           </w:tcPr>
           <w:p>
@@ -8559,7 +8688,7 @@
         </w:trPr>
         <w:tc>
           <w:tcPr>
-            <w:tcW w:w="794" w:type="dxa"/>
+            <w:tcW w:w="680" w:type="dxa"/>
             <w:vAlign w:val="center"/>
           </w:tcPr>
           <w:p>
@@ -8576,7 +8705,7 @@
         </w:tc>
         <w:tc>
           <w:tcPr>
-            <w:tcW w:w="4592" w:type="dxa"/>
+            <w:tcW w:w="3628" w:type="dxa"/>
             <w:vAlign w:val="center"/>
           </w:tcPr>
           <w:p>
@@ -8593,24 +8722,24 @@
         </w:tc>
         <w:tc>
           <w:tcPr>
-            <w:tcW w:w="850" w:type="dxa"/>
-            <w:vAlign w:val="center"/>
-          </w:tcPr>
-          <w:p>
-            <w:pPr>
-              <w:spacing w:before="60" w:after="60" w:line="252" w:lineRule="auto"/>
-            </w:pPr>
-            <w:r>
-              <w:rPr>
-                <w:sz w:val="21"/>
-              </w:rPr>
-              <w:t>W04</w:t>
-            </w:r>
-          </w:p>
-        </w:tc>
-        <w:tc>
-          <w:tcPr>
-            <w:tcW w:w="2778" w:type="dxa"/>
+            <w:tcW w:w="2098" w:type="dxa"/>
+            <w:vAlign w:val="center"/>
+          </w:tcPr>
+          <w:p>
+            <w:pPr>
+              <w:spacing w:before="60" w:after="60" w:line="252" w:lineRule="auto"/>
+            </w:pPr>
+            <w:r>
+              <w:rPr>
+                <w:sz w:val="21"/>
+              </w:rPr>
+              <w:t>Images and ZIP</w:t>
+            </w:r>
+          </w:p>
+        </w:tc>
+        <w:tc>
+          <w:tcPr>
+            <w:tcW w:w="2608" w:type="dxa"/>
             <w:vAlign w:val="center"/>
           </w:tcPr>
           <w:p>
@@ -8633,24 +8762,25 @@
         </w:trPr>
         <w:tc>
           <w:tcPr>
-            <w:tcW w:w="794" w:type="dxa"/>
-            <w:vAlign w:val="center"/>
-          </w:tcPr>
-          <w:p>
-            <w:pPr>
-              <w:spacing w:before="60" w:after="60" w:line="252" w:lineRule="auto"/>
-            </w:pPr>
-            <w:r>
-              <w:rPr>
-                <w:sz w:val="21"/>
-              </w:rPr>
+            <w:tcW w:w="680" w:type="dxa"/>
+            <w:vAlign w:val="center"/>
+          </w:tcPr>
+          <w:p>
+            <w:pPr>
+              <w:spacing w:before="60" w:after="60" w:line="252" w:lineRule="auto"/>
+            </w:pPr>
+            <w:r>
+              <w:rPr>
+                <w:sz w:val="21"/>
+              </w:rPr>
+              <w:lastRenderedPageBreak/>
               <w:t>API07</w:t>
             </w:r>
           </w:p>
         </w:tc>
         <w:tc>
           <w:tcPr>
-            <w:tcW w:w="4592" w:type="dxa"/>
+            <w:tcW w:w="3628" w:type="dxa"/>
             <w:vAlign w:val="center"/>
           </w:tcPr>
           <w:p>
@@ -8667,24 +8797,24 @@
         </w:tc>
         <w:tc>
           <w:tcPr>
-            <w:tcW w:w="850" w:type="dxa"/>
-            <w:vAlign w:val="center"/>
-          </w:tcPr>
-          <w:p>
-            <w:pPr>
-              <w:spacing w:before="60" w:after="60" w:line="252" w:lineRule="auto"/>
-            </w:pPr>
-            <w:r>
-              <w:rPr>
-                <w:sz w:val="21"/>
-              </w:rPr>
-              <w:t>W06</w:t>
-            </w:r>
-          </w:p>
-        </w:tc>
-        <w:tc>
-          <w:tcPr>
-            <w:tcW w:w="2778" w:type="dxa"/>
+            <w:tcW w:w="2098" w:type="dxa"/>
+            <w:vAlign w:val="center"/>
+          </w:tcPr>
+          <w:p>
+            <w:pPr>
+              <w:spacing w:before="60" w:after="60" w:line="252" w:lineRule="auto"/>
+            </w:pPr>
+            <w:r>
+              <w:rPr>
+                <w:sz w:val="21"/>
+              </w:rPr>
+              <w:t>Encryption and permissions</w:t>
+            </w:r>
+          </w:p>
+        </w:tc>
+        <w:tc>
+          <w:tcPr>
+            <w:tcW w:w="2608" w:type="dxa"/>
             <w:vAlign w:val="center"/>
           </w:tcPr>
           <w:p>
@@ -8707,7 +8837,7 @@
         </w:trPr>
         <w:tc>
           <w:tcPr>
-            <w:tcW w:w="794" w:type="dxa"/>
+            <w:tcW w:w="680" w:type="dxa"/>
             <w:vAlign w:val="center"/>
           </w:tcPr>
           <w:p>
@@ -8724,7 +8854,7 @@
         </w:tc>
         <w:tc>
           <w:tcPr>
-            <w:tcW w:w="4592" w:type="dxa"/>
+            <w:tcW w:w="3628" w:type="dxa"/>
             <w:vAlign w:val="center"/>
           </w:tcPr>
           <w:p>
@@ -8741,24 +8871,24 @@
         </w:tc>
         <w:tc>
           <w:tcPr>
-            <w:tcW w:w="850" w:type="dxa"/>
-            <w:vAlign w:val="center"/>
-          </w:tcPr>
-          <w:p>
-            <w:pPr>
-              <w:spacing w:before="60" w:after="60" w:line="252" w:lineRule="auto"/>
-            </w:pPr>
-            <w:r>
-              <w:rPr>
-                <w:sz w:val="21"/>
-              </w:rPr>
-              <w:t>W07</w:t>
-            </w:r>
-          </w:p>
-        </w:tc>
-        <w:tc>
-          <w:tcPr>
-            <w:tcW w:w="2778" w:type="dxa"/>
+            <w:tcW w:w="2098" w:type="dxa"/>
+            <w:vAlign w:val="center"/>
+          </w:tcPr>
+          <w:p>
+            <w:pPr>
+              <w:spacing w:before="60" w:after="60" w:line="252" w:lineRule="auto"/>
+            </w:pPr>
+            <w:r>
+              <w:rPr>
+                <w:sz w:val="21"/>
+              </w:rPr>
+              <w:t>Digital signatures</w:t>
+            </w:r>
+          </w:p>
+        </w:tc>
+        <w:tc>
+          <w:tcPr>
+            <w:tcW w:w="2608" w:type="dxa"/>
             <w:vAlign w:val="center"/>
           </w:tcPr>
           <w:p>
@@ -8781,25 +8911,24 @@
         </w:trPr>
         <w:tc>
           <w:tcPr>
-            <w:tcW w:w="794" w:type="dxa"/>
-            <w:vAlign w:val="center"/>
-          </w:tcPr>
-          <w:p>
-            <w:pPr>
-              <w:spacing w:before="60" w:after="60" w:line="252" w:lineRule="auto"/>
-            </w:pPr>
-            <w:r>
-              <w:rPr>
-                <w:sz w:val="21"/>
-              </w:rPr>
-              <w:lastRenderedPageBreak/>
+            <w:tcW w:w="680" w:type="dxa"/>
+            <w:vAlign w:val="center"/>
+          </w:tcPr>
+          <w:p>
+            <w:pPr>
+              <w:spacing w:before="60" w:after="60" w:line="252" w:lineRule="auto"/>
+            </w:pPr>
+            <w:r>
+              <w:rPr>
+                <w:sz w:val="21"/>
+              </w:rPr>
               <w:t>API09</w:t>
             </w:r>
           </w:p>
         </w:tc>
         <w:tc>
           <w:tcPr>
-            <w:tcW w:w="4592" w:type="dxa"/>
+            <w:tcW w:w="3628" w:type="dxa"/>
             <w:vAlign w:val="center"/>
           </w:tcPr>
           <w:p>
@@ -8816,24 +8945,24 @@
         </w:tc>
         <w:tc>
           <w:tcPr>
-            <w:tcW w:w="850" w:type="dxa"/>
-            <w:vAlign w:val="center"/>
-          </w:tcPr>
-          <w:p>
-            <w:pPr>
-              <w:spacing w:before="60" w:after="60" w:line="252" w:lineRule="auto"/>
-            </w:pPr>
-            <w:r>
-              <w:rPr>
-                <w:sz w:val="21"/>
-              </w:rPr>
-              <w:t>W07</w:t>
-            </w:r>
-          </w:p>
-        </w:tc>
-        <w:tc>
-          <w:tcPr>
-            <w:tcW w:w="2778" w:type="dxa"/>
+            <w:tcW w:w="2098" w:type="dxa"/>
+            <w:vAlign w:val="center"/>
+          </w:tcPr>
+          <w:p>
+            <w:pPr>
+              <w:spacing w:before="60" w:after="60" w:line="252" w:lineRule="auto"/>
+            </w:pPr>
+            <w:r>
+              <w:rPr>
+                <w:sz w:val="21"/>
+              </w:rPr>
+              <w:t>Digital signatures</w:t>
+            </w:r>
+          </w:p>
+        </w:tc>
+        <w:tc>
+          <w:tcPr>
+            <w:tcW w:w="2608" w:type="dxa"/>
             <w:vAlign w:val="center"/>
           </w:tcPr>
           <w:p>
@@ -8856,7 +8985,7 @@
         </w:trPr>
         <w:tc>
           <w:tcPr>
-            <w:tcW w:w="794" w:type="dxa"/>
+            <w:tcW w:w="680" w:type="dxa"/>
             <w:vAlign w:val="center"/>
           </w:tcPr>
           <w:p>
@@ -8873,7 +9002,7 @@
         </w:tc>
         <w:tc>
           <w:tcPr>
-            <w:tcW w:w="4592" w:type="dxa"/>
+            <w:tcW w:w="3628" w:type="dxa"/>
             <w:vAlign w:val="center"/>
           </w:tcPr>
           <w:p>
@@ -8890,24 +9019,24 @@
         </w:tc>
         <w:tc>
           <w:tcPr>
-            <w:tcW w:w="850" w:type="dxa"/>
-            <w:vAlign w:val="center"/>
-          </w:tcPr>
-          <w:p>
-            <w:pPr>
-              <w:spacing w:before="60" w:after="60" w:line="252" w:lineRule="auto"/>
-            </w:pPr>
-            <w:r>
-              <w:rPr>
-                <w:sz w:val="21"/>
-              </w:rPr>
-              <w:t>W07</w:t>
-            </w:r>
-          </w:p>
-        </w:tc>
-        <w:tc>
-          <w:tcPr>
-            <w:tcW w:w="2778" w:type="dxa"/>
+            <w:tcW w:w="2098" w:type="dxa"/>
+            <w:vAlign w:val="center"/>
+          </w:tcPr>
+          <w:p>
+            <w:pPr>
+              <w:spacing w:before="60" w:after="60" w:line="252" w:lineRule="auto"/>
+            </w:pPr>
+            <w:r>
+              <w:rPr>
+                <w:sz w:val="21"/>
+              </w:rPr>
+              <w:t>Digital signatures</w:t>
+            </w:r>
+          </w:p>
+        </w:tc>
+        <w:tc>
+          <w:tcPr>
+            <w:tcW w:w="2608" w:type="dxa"/>
             <w:vAlign w:val="center"/>
           </w:tcPr>
           <w:p>
@@ -8930,7 +9059,7 @@
         </w:trPr>
         <w:tc>
           <w:tcPr>
-            <w:tcW w:w="794" w:type="dxa"/>
+            <w:tcW w:w="680" w:type="dxa"/>
             <w:vAlign w:val="center"/>
           </w:tcPr>
           <w:p>
@@ -8947,7 +9076,7 @@
         </w:tc>
         <w:tc>
           <w:tcPr>
-            <w:tcW w:w="4592" w:type="dxa"/>
+            <w:tcW w:w="3628" w:type="dxa"/>
             <w:vAlign w:val="center"/>
           </w:tcPr>
           <w:p>
@@ -8964,24 +9093,24 @@
         </w:tc>
         <w:tc>
           <w:tcPr>
-            <w:tcW w:w="850" w:type="dxa"/>
-            <w:vAlign w:val="center"/>
-          </w:tcPr>
-          <w:p>
-            <w:pPr>
-              <w:spacing w:before="60" w:after="60" w:line="252" w:lineRule="auto"/>
-            </w:pPr>
-            <w:r>
-              <w:rPr>
-                <w:sz w:val="21"/>
-              </w:rPr>
-              <w:t>W08</w:t>
-            </w:r>
-          </w:p>
-        </w:tc>
-        <w:tc>
-          <w:tcPr>
-            <w:tcW w:w="2778" w:type="dxa"/>
+            <w:tcW w:w="2098" w:type="dxa"/>
+            <w:vAlign w:val="center"/>
+          </w:tcPr>
+          <w:p>
+            <w:pPr>
+              <w:spacing w:before="60" w:after="60" w:line="252" w:lineRule="auto"/>
+            </w:pPr>
+            <w:r>
+              <w:rPr>
+                <w:sz w:val="21"/>
+              </w:rPr>
+              <w:t>Watermarks</w:t>
+            </w:r>
+          </w:p>
+        </w:tc>
+        <w:tc>
+          <w:tcPr>
+            <w:tcW w:w="2608" w:type="dxa"/>
             <w:vAlign w:val="center"/>
           </w:tcPr>
           <w:p>
@@ -9009,7 +9138,7 @@
           <w:noProof/>
         </w:rPr>
         <w:drawing>
-          <wp:inline distT="0" distB="0" distL="0" distR="0" wp14:anchorId="29EA7730" wp14:editId="22EB2DC7">
+          <wp:inline distT="0" distB="0" distL="0" distR="0" wp14:anchorId="6243D0CF" wp14:editId="5EAE7B7A">
             <wp:extent cx="5760000" cy="4500000"/>
             <wp:effectExtent l="0" t="0" r="0" b="0"/>
             <wp:docPr id="10" name="Picture 10"/>

</xml_diff>